<commit_message>
Privacy: remove bank account & bank name from public Company Profile downloads
- EternalCNC-Company-Profile-CN.docx (and .bak): removed '开户银行 平安银行深圳松岗支行' and '银行账号 15174349860039' rows from the financial-info table
- Retained company name, taxpayer ID, registered address, phone per prior policy (phone to be decided)
- No bank account now exposed in any public/downloads file; verified via full-site scan (0 hits)
</commit_message>
<xml_diff>
--- a/public/downloads/EternalCNC-Company-Profile-CN.docx
+++ b/public/downloads/EternalCNC-Company-Profile-CN.docx
@@ -772,149 +772,6 @@
                 <w:szCs w:val="21"/>
               </w:rPr>
               <w:t>18018704996</w:t>
-            </w:r>
-          </w:p>
-        </w:tc>
-      </w:tr>
-      <w:tr>
-        <w:trPr/>
-        <w:tc>
-          <w:tcPr>
-            <w:tcW w:w="2600" w:type="dxa"/>
-            <w:tcBorders>
-              <w:top w:val="single" w:color="BFBFBF" w:sz="4" w:space="0"/>
-              <w:left w:val="single" w:color="BFBFBF" w:sz="4" w:space="0"/>
-              <w:bottom w:val="single" w:color="BFBFBF" w:sz="4" w:space="0"/>
-              <w:right w:val="single" w:color="BFBFBF" w:sz="4" w:space="0"/>
-            </w:tcBorders>
-            <w:shd w:val="clear" w:color="auto" w:fill="F2F2F2"/>
-            <w:tcMar>
-              <w:top w:w="60" w:type="dxa"/>
-              <w:left w:w="120" w:type="dxa"/>
-              <w:bottom w:w="60" w:type="dxa"/>
-              <w:right w:w="120" w:type="dxa"/>
-            </w:tcMar>
-            <w:vAlign w:val="center"/>
-          </w:tcPr>
-          <w:p>
-            <w:pPr>
-              <w:jc w:val="left"/>
-            </w:pPr>
-            <w:r>
-              <w:rPr>
-                <w:rFonts w:hint="eastAsia"/>
-                <w:b w:val="1"/>
-                <w:bCs w:val="1"/>
-                <w:color w:val="000000"/>
-                <w:sz w:val="21"/>
-                <w:szCs w:val="21"/>
-              </w:rPr>
-              <w:t>开户银行</w:t>
-            </w:r>
-          </w:p>
-        </w:tc>
-        <w:tc>
-          <w:tcPr>
-            <w:tcW w:w="6760" w:type="dxa"/>
-            <w:tcBorders>
-              <w:top w:val="single" w:color="BFBFBF" w:sz="4" w:space="0"/>
-              <w:left w:val="single" w:color="BFBFBF" w:sz="4" w:space="0"/>
-              <w:bottom w:val="single" w:color="BFBFBF" w:sz="4" w:space="0"/>
-              <w:right w:val="single" w:color="BFBFBF" w:sz="4" w:space="0"/>
-            </w:tcBorders>
-            <w:tcMar>
-              <w:top w:w="60" w:type="dxa"/>
-              <w:left w:w="120" w:type="dxa"/>
-              <w:bottom w:w="60" w:type="dxa"/>
-              <w:right w:w="120" w:type="dxa"/>
-            </w:tcMar>
-            <w:vAlign w:val="center"/>
-          </w:tcPr>
-          <w:p>
-            <w:pPr>
-              <w:jc w:val="left"/>
-            </w:pPr>
-            <w:r>
-              <w:rPr>
-                <w:rFonts w:hint="eastAsia"/>
-                <w:b w:val="0"/>
-                <w:bCs w:val="0"/>
-                <w:color w:val="000000"/>
-                <w:sz w:val="21"/>
-                <w:szCs w:val="21"/>
-              </w:rPr>
-              <w:t>平安银行深圳松岗支行</w:t>
-            </w:r>
-          </w:p>
-        </w:tc>
-      </w:tr>
-      <w:tr>
-        <w:trPr/>
-        <w:tc>
-          <w:tcPr>
-            <w:tcW w:w="2600" w:type="dxa"/>
-            <w:tcBorders>
-              <w:top w:val="single" w:color="BFBFBF" w:sz="4" w:space="0"/>
-              <w:left w:val="single" w:color="BFBFBF" w:sz="4" w:space="0"/>
-              <w:bottom w:val="single" w:color="BFBFBF" w:sz="4" w:space="0"/>
-              <w:right w:val="single" w:color="BFBFBF" w:sz="4" w:space="0"/>
-            </w:tcBorders>
-            <w:shd w:val="clear" w:color="auto" w:fill="F2F2F2"/>
-            <w:tcMar>
-              <w:top w:w="60" w:type="dxa"/>
-              <w:left w:w="120" w:type="dxa"/>
-              <w:bottom w:w="60" w:type="dxa"/>
-              <w:right w:w="120" w:type="dxa"/>
-            </w:tcMar>
-            <w:vAlign w:val="center"/>
-          </w:tcPr>
-          <w:p>
-            <w:pPr>
-              <w:jc w:val="left"/>
-            </w:pPr>
-            <w:r>
-              <w:rPr>
-                <w:rFonts w:hint="eastAsia"/>
-                <w:b w:val="1"/>
-                <w:bCs w:val="1"/>
-                <w:color w:val="000000"/>
-                <w:sz w:val="21"/>
-                <w:szCs w:val="21"/>
-              </w:rPr>
-              <w:t>银行账号</w:t>
-            </w:r>
-          </w:p>
-        </w:tc>
-        <w:tc>
-          <w:tcPr>
-            <w:tcW w:w="6760" w:type="dxa"/>
-            <w:tcBorders>
-              <w:top w:val="single" w:color="BFBFBF" w:sz="4" w:space="0"/>
-              <w:left w:val="single" w:color="BFBFBF" w:sz="4" w:space="0"/>
-              <w:bottom w:val="single" w:color="BFBFBF" w:sz="4" w:space="0"/>
-              <w:right w:val="single" w:color="BFBFBF" w:sz="4" w:space="0"/>
-            </w:tcBorders>
-            <w:tcMar>
-              <w:top w:w="60" w:type="dxa"/>
-              <w:left w:w="120" w:type="dxa"/>
-              <w:bottom w:w="60" w:type="dxa"/>
-              <w:right w:w="120" w:type="dxa"/>
-            </w:tcMar>
-            <w:vAlign w:val="center"/>
-          </w:tcPr>
-          <w:p>
-            <w:pPr>
-              <w:jc w:val="left"/>
-            </w:pPr>
-            <w:r>
-              <w:rPr>
-                <w:b w:val="0"/>
-                <w:bCs w:val="0"/>
-                <w:color w:val="000000"/>
-                <w:sz w:val="21"/>
-                <w:szCs w:val="21"/>
-              </w:rPr>
-              <w:t>15174349860039</w:t>
             </w:r>
           </w:p>
         </w:tc>

</xml_diff>

<commit_message>
Privacy: remove phone number from Company Profile downloads
- EternalCNC-Company-Profile-CN.docx (+ .bak): deleted the '电话' row (18018704996) from the financial-info table
- Retained company name, taxpayer ID, registered address
- Verified via full-site scan: no phone/bank-account tokens remain in public/downloads or dist/downloads
</commit_message>
<xml_diff>
--- a/public/downloads/EternalCNC-Company-Profile-CN.docx
+++ b/public/downloads/EternalCNC-Company-Profile-CN.docx
@@ -51,12 +51,12 @@
     </w:p>
     <w:p>
       <w:pPr>
-        <w:pStyle w:val="000002"/>
+        <w:pStyle w:val="000014"/>
       </w:pPr>
     </w:p>
     <w:p>
       <w:pPr>
-        <w:pStyle w:val="000002"/>
+        <w:pStyle w:val="000014"/>
       </w:pPr>
       <w:r>
         <w:rPr>
@@ -67,7 +67,7 @@
     </w:p>
     <w:tbl>
       <w:tblPr>
-        <w:tblStyle w:val="000009"/>
+        <w:tblStyle w:val="000013"/>
         <w:tblW w:w="9360" w:type="dxa"/>
         <w:tblInd w:w="0" w:type="dxa"/>
         <w:tblBorders>
@@ -451,12 +451,12 @@
     </w:tbl>
     <w:p>
       <w:pPr>
-        <w:pStyle w:val="000002"/>
+        <w:pStyle w:val="000014"/>
       </w:pPr>
     </w:p>
     <w:p>
       <w:pPr>
-        <w:pStyle w:val="000002"/>
+        <w:pStyle w:val="000014"/>
       </w:pPr>
       <w:r>
         <w:rPr>
@@ -467,7 +467,7 @@
     </w:p>
     <w:tbl>
       <w:tblPr>
-        <w:tblStyle w:val="000009"/>
+        <w:tblStyle w:val="000013"/>
         <w:tblW w:w="9360" w:type="dxa"/>
         <w:tblInd w:w="0" w:type="dxa"/>
         <w:tblBorders>
@@ -705,87 +705,10 @@
           </w:p>
         </w:tc>
       </w:tr>
-      <w:tr>
-        <w:trPr/>
-        <w:tc>
-          <w:tcPr>
-            <w:tcW w:w="2600" w:type="dxa"/>
-            <w:tcBorders>
-              <w:top w:val="single" w:color="BFBFBF" w:sz="4" w:space="0"/>
-              <w:left w:val="single" w:color="BFBFBF" w:sz="4" w:space="0"/>
-              <w:bottom w:val="single" w:color="BFBFBF" w:sz="4" w:space="0"/>
-              <w:right w:val="single" w:color="BFBFBF" w:sz="4" w:space="0"/>
-            </w:tcBorders>
-            <w:shd w:val="clear" w:color="auto" w:fill="F2F2F2"/>
-            <w:tcMar>
-              <w:top w:w="60" w:type="dxa"/>
-              <w:left w:w="120" w:type="dxa"/>
-              <w:bottom w:w="60" w:type="dxa"/>
-              <w:right w:w="120" w:type="dxa"/>
-            </w:tcMar>
-            <w:vAlign w:val="center"/>
-          </w:tcPr>
-          <w:p>
-            <w:pPr>
-              <w:jc w:val="left"/>
-            </w:pPr>
-            <w:r>
-              <w:rPr>
-                <w:rFonts w:hint="eastAsia"/>
-                <w:b w:val="1"/>
-                <w:bCs w:val="1"/>
-                <w:color w:val="000000"/>
-                <w:sz w:val="21"/>
-                <w:szCs w:val="21"/>
-              </w:rPr>
-              <w:t>电话</w:t>
-            </w:r>
-          </w:p>
-        </w:tc>
-        <w:tc>
-          <w:tcPr>
-            <w:tcW w:w="6760" w:type="dxa"/>
-            <w:tcBorders>
-              <w:top w:val="single" w:color="BFBFBF" w:sz="4" w:space="0"/>
-              <w:left w:val="single" w:color="BFBFBF" w:sz="4" w:space="0"/>
-              <w:bottom w:val="single" w:color="BFBFBF" w:sz="4" w:space="0"/>
-              <w:right w:val="single" w:color="BFBFBF" w:sz="4" w:space="0"/>
-            </w:tcBorders>
-            <w:tcMar>
-              <w:top w:w="60" w:type="dxa"/>
-              <w:left w:w="120" w:type="dxa"/>
-              <w:bottom w:w="60" w:type="dxa"/>
-              <w:right w:w="120" w:type="dxa"/>
-            </w:tcMar>
-            <w:vAlign w:val="center"/>
-          </w:tcPr>
-          <w:p>
-            <w:pPr>
-              <w:jc w:val="left"/>
-            </w:pPr>
-            <w:r>
-              <w:rPr>
-                <w:b w:val="0"/>
-                <w:bCs w:val="0"/>
-                <w:color w:val="000000"/>
-                <w:sz w:val="21"/>
-                <w:szCs w:val="21"/>
-              </w:rPr>
-              <w:t>18018704996</w:t>
-            </w:r>
-          </w:p>
-        </w:tc>
-      </w:tr>
     </w:tbl>
-    <w:p>
-      <w:pPr/>
-    </w:p>
-    <w:p>
-      <w:pPr/>
-    </w:p>
-    <w:p>
-      <w:pPr/>
-    </w:p>
+    <w:p/>
+    <w:p/>
+    <w:p/>
     <w:p>
       <w:pPr>
         <w:spacing w:before="300"/>
@@ -815,18 +738,15 @@
       <w:bookmarkStart w:id="1" w:name="_GoBack"/>
       <w:bookmarkEnd w:id="1"/>
     </w:p>
+    <w:p/>
     <w:p>
-      <w:pPr/>
-    </w:p>
-    <w:p>
-      <w:pPr/>
       <w:r>
         <w:br w:type="page"/>
       </w:r>
     </w:p>
     <w:p>
       <w:pPr>
-        <w:pStyle w:val="000002"/>
+        <w:pStyle w:val="000014"/>
       </w:pPr>
       <w:r>
         <w:rPr>
@@ -852,7 +772,7 @@
     </w:p>
     <w:tbl>
       <w:tblPr>
-        <w:tblStyle w:val="000009"/>
+        <w:tblStyle w:val="000013"/>
         <w:tblW w:w="9569" w:type="dxa"/>
         <w:tblInd w:w="0" w:type="dxa"/>
         <w:tblBorders>
@@ -3186,7 +3106,7 @@
     </w:tbl>
     <w:p>
       <w:pPr>
-        <w:pStyle w:val="000005"/>
+        <w:pStyle w:val="000004"/>
         <w:bidi w:val="0"/>
         <w:rPr>
           <w:rFonts w:hint="eastAsia"/>
@@ -3203,7 +3123,7 @@
     </w:p>
     <w:p>
       <w:pPr>
-        <w:pStyle w:val="000002"/>
+        <w:pStyle w:val="000014"/>
         <w:bidi w:val="0"/>
         <w:rPr>
           <w:rFonts w:hint="eastAsia"/>
@@ -3277,7 +3197,7 @@
     </w:p>
     <w:p>
       <w:pPr>
-        <w:pStyle w:val="000002"/>
+        <w:pStyle w:val="000014"/>
         <w:bidi w:val="0"/>
       </w:pPr>
       <w:r>
@@ -3402,269 +3322,285 @@
     <w:pPrDefault/>
   </w:docDefaults>
   <w:latentStyles w:defLockedState="0" w:defUIPriority="99" w:defSemiHidden="1" w:defUnhideWhenUsed="1" w:defQFormat="0" w:count="260">
-    <w:lsdException w:name="List 3" w:uiPriority="0" w:semiHidden="0" w:unhideWhenUsed="0"/>
+    <w:lsdException w:name="Table 3D effects 2" w:uiPriority="0" w:semiHidden="0" w:unhideWhenUsed="0"/>
+    <w:lsdException w:name="Colorful Grid Accent 4" w:uiPriority="73" w:semiHidden="0" w:unhideWhenUsed="0"/>
+    <w:lsdException w:name="Table Grid 5" w:uiPriority="0" w:semiHidden="0" w:unhideWhenUsed="0"/>
+    <w:lsdException w:name="List Continue" w:uiPriority="0" w:semiHidden="0" w:unhideWhenUsed="0"/>
+    <w:lsdException w:name="Table Columns 3" w:uiPriority="0" w:semiHidden="0" w:unhideWhenUsed="0"/>
+    <w:lsdException w:name="Medium Grid 1 Accent 4" w:uiPriority="67" w:semiHidden="0" w:unhideWhenUsed="0"/>
+    <w:lsdException w:name="Dark List Accent 3" w:uiPriority="70" w:semiHidden="0" w:unhideWhenUsed="0"/>
+    <w:lsdException w:name="Medium Grid 2 Accent 6" w:uiPriority="68" w:semiHidden="0" w:unhideWhenUsed="0"/>
+    <w:lsdException w:name="List Number 4" w:uiPriority="0" w:semiHidden="0" w:unhideWhenUsed="0"/>
+    <w:lsdException w:name="Medium List 2" w:uiPriority="66" w:semiHidden="0" w:unhideWhenUsed="0"/>
+    <w:lsdException w:name="endnote reference" w:uiPriority="99" w:qFormat="1"/>
+    <w:lsdException w:name="Table Theme" w:uiPriority="0" w:semiHidden="0" w:unhideWhenUsed="0"/>
+    <w:lsdException w:name="Light Shading Accent 3" w:uiPriority="60" w:semiHidden="0" w:unhideWhenUsed="0"/>
+    <w:lsdException w:name="Medium List 1 Accent 5" w:uiPriority="65" w:semiHidden="0" w:unhideWhenUsed="0"/>
+    <w:lsdException w:name="line number" w:uiPriority="0" w:semiHidden="0" w:unhideWhenUsed="0"/>
+    <w:lsdException w:name="Table Grid 7" w:uiPriority="0" w:semiHidden="0" w:unhideWhenUsed="0"/>
+    <w:lsdException w:name="Table Columns 4" w:uiPriority="0" w:semiHidden="0" w:unhideWhenUsed="0"/>
+    <w:lsdException w:name="heading 2" w:uiPriority="0" w:semiHidden="0" w:unhideWhenUsed="0" w:qFormat="1"/>
+    <w:lsdException w:name="HTML Variable" w:uiPriority="0" w:semiHidden="0" w:unhideWhenUsed="0"/>
+    <w:lsdException w:name="caption" w:uiPriority="0" w:qFormat="1"/>
+    <w:lsdException w:name="toa heading" w:uiPriority="0" w:semiHidden="0" w:unhideWhenUsed="0"/>
+    <w:lsdException w:name="Medium List 2 Accent 3" w:uiPriority="66" w:semiHidden="0" w:unhideWhenUsed="0"/>
+    <w:lsdException w:name="Closing" w:uiPriority="0" w:semiHidden="0" w:unhideWhenUsed="0"/>
+    <w:lsdException w:name="Medium Shading 1 Accent 6" w:uiPriority="63" w:semiHidden="0" w:unhideWhenUsed="0"/>
+    <w:lsdException w:name="Colorful List Accent 5" w:uiPriority="72" w:semiHidden="0" w:unhideWhenUsed="0"/>
+    <w:lsdException w:name="Light Grid Accent 5" w:uiPriority="62" w:semiHidden="0" w:unhideWhenUsed="0"/>
+    <w:lsdException w:name="Dark List Accent 6" w:uiPriority="70" w:semiHidden="0" w:unhideWhenUsed="0"/>
+    <w:lsdException w:name="Medium Shading 2 Accent 1" w:uiPriority="64" w:semiHidden="0" w:unhideWhenUsed="0"/>
+    <w:lsdException w:name="Table Grid 8" w:uiPriority="0" w:semiHidden="0" w:unhideWhenUsed="0"/>
+    <w:lsdException w:name="Medium Grid 3 Accent 5" w:uiPriority="69" w:semiHidden="0" w:unhideWhenUsed="0"/>
+    <w:lsdException w:name="index 4" w:uiPriority="0" w:semiHidden="0" w:unhideWhenUsed="0"/>
+    <w:lsdException w:name="heading 4" w:uiPriority="0" w:semiHidden="0" w:unhideWhenUsed="0" w:qFormat="1"/>
+    <w:lsdException w:name="Medium Shading 1 Accent 2" w:uiPriority="63" w:semiHidden="0" w:unhideWhenUsed="0"/>
+    <w:lsdException w:name="Colorful Grid Accent 6" w:uiPriority="73" w:semiHidden="0" w:unhideWhenUsed="0"/>
+    <w:lsdException w:name="List Bullet 5" w:uiPriority="0" w:semiHidden="0" w:unhideWhenUsed="0"/>
+    <w:lsdException w:name="Medium Shading 2 Accent 5" w:uiPriority="64" w:semiHidden="0" w:unhideWhenUsed="0"/>
+    <w:lsdException w:name="Title" w:uiPriority="0" w:semiHidden="0" w:unhideWhenUsed="0" w:qFormat="1"/>
+    <w:lsdException w:name="Normal Table" w:uiPriority="0" w:unhideWhenUsed="0" w:qFormat="1"/>
+    <w:lsdException w:name="HTML Cite" w:uiPriority="0" w:semiHidden="0" w:unhideWhenUsed="0"/>
+    <w:lsdException w:name="Medium List 2 Accent 1" w:uiPriority="66" w:semiHidden="0" w:unhideWhenUsed="0"/>
+    <w:lsdException w:name="List Continue 3" w:uiPriority="0" w:semiHidden="0" w:unhideWhenUsed="0"/>
+    <w:lsdException w:name="Table List 8" w:uiPriority="0" w:semiHidden="0" w:unhideWhenUsed="0"/>
+    <w:lsdException w:name="index 2" w:uiPriority="0" w:semiHidden="0" w:unhideWhenUsed="0"/>
+    <w:lsdException w:name="Colorful List" w:uiPriority="72" w:semiHidden="0" w:unhideWhenUsed="0"/>
+    <w:lsdException w:name="Light Shading Accent 5" w:uiPriority="60" w:semiHidden="0" w:unhideWhenUsed="0"/>
+    <w:lsdException w:name="Medium Grid 1 Accent 2" w:uiPriority="67" w:semiHidden="0" w:unhideWhenUsed="0"/>
+    <w:lsdException w:name="Body Text Indent" w:uiPriority="0" w:semiHidden="0" w:unhideWhenUsed="0"/>
+    <w:lsdException w:name="Note Heading" w:uiPriority="0" w:semiHidden="0" w:unhideWhenUsed="0"/>
+    <w:lsdException w:name="heading 7" w:uiPriority="0" w:qFormat="1"/>
+    <w:lsdException w:name="Table Simple 3" w:uiPriority="0" w:semiHidden="0" w:unhideWhenUsed="0"/>
+    <w:lsdException w:name="envelope return" w:uiPriority="0" w:semiHidden="0" w:unhideWhenUsed="0"/>
+    <w:lsdException w:name="List Continue 5" w:uiPriority="0" w:semiHidden="0" w:unhideWhenUsed="0"/>
+    <w:lsdException w:name="Body Text" w:uiPriority="0" w:semiHidden="0" w:unhideWhenUsed="0"/>
+    <w:lsdException w:name="Table Grid 2" w:uiPriority="0" w:semiHidden="0" w:unhideWhenUsed="0"/>
+    <w:lsdException w:name="Dark List" w:uiPriority="70" w:semiHidden="0" w:unhideWhenUsed="0"/>
+    <w:lsdException w:name="List 5" w:uiPriority="0" w:semiHidden="0" w:unhideWhenUsed="0"/>
+    <w:lsdException w:name="Medium Grid 3 Accent 3" w:uiPriority="69" w:semiHidden="0" w:unhideWhenUsed="0"/>
+    <w:lsdException w:name="Dark List Accent 4" w:uiPriority="70" w:semiHidden="0" w:unhideWhenUsed="0"/>
+    <w:lsdException w:name="Body Text 3" w:uiPriority="0" w:semiHidden="0" w:unhideWhenUsed="0"/>
+    <w:lsdException w:name="Light List Accent 6" w:uiPriority="61" w:semiHidden="0" w:unhideWhenUsed="0"/>
+    <w:lsdException w:name="toc 2" w:uiPriority="0" w:semiHidden="0" w:unhideWhenUsed="0"/>
+    <w:lsdException w:name="List Continue 4" w:uiPriority="0" w:semiHidden="0" w:unhideWhenUsed="0"/>
+    <w:lsdException w:name="HTML Address" w:uiPriority="0" w:semiHidden="0" w:unhideWhenUsed="0"/>
+    <w:lsdException w:name="Colorful List Accent 1" w:uiPriority="72" w:semiHidden="0" w:unhideWhenUsed="0"/>
+    <w:lsdException w:name="header" w:uiPriority="0" w:semiHidden="0" w:unhideWhenUsed="0"/>
+    <w:lsdException w:name="HTML Keyboard" w:uiPriority="0" w:semiHidden="0" w:unhideWhenUsed="0"/>
+    <w:lsdException w:name="Dark List Accent 2" w:uiPriority="70" w:semiHidden="0" w:unhideWhenUsed="0"/>
+    <w:lsdException w:name="Medium List 1 Accent 2" w:uiPriority="65" w:semiHidden="0" w:unhideWhenUsed="0"/>
+    <w:lsdException w:name="Medium Grid 1 Accent 5" w:uiPriority="67" w:semiHidden="0" w:unhideWhenUsed="0"/>
+    <w:lsdException w:name="index heading" w:uiPriority="0" w:semiHidden="0" w:unhideWhenUsed="0"/>
+    <w:lsdException w:name="Colorful Shading Accent 5" w:uiPriority="71" w:semiHidden="0" w:unhideWhenUsed="0"/>
+    <w:lsdException w:name="Table List 5" w:uiPriority="0" w:semiHidden="0" w:unhideWhenUsed="0"/>
+    <w:lsdException w:name="Colorful Grid" w:uiPriority="73" w:semiHidden="0" w:unhideWhenUsed="0"/>
+    <w:lsdException w:name="toc 4" w:uiPriority="0" w:semiHidden="0" w:unhideWhenUsed="0"/>
+    <w:lsdException w:name="index 8" w:uiPriority="0" w:semiHidden="0" w:unhideWhenUsed="0"/>
+    <w:lsdException w:name="annotation text" w:uiPriority="0" w:semiHidden="0" w:unhideWhenUsed="0"/>
+    <w:lsdException w:name="Body Text Indent 3" w:uiPriority="0" w:semiHidden="0" w:unhideWhenUsed="0"/>
+    <w:lsdException w:name="Table Professional" w:uiPriority="0" w:semiHidden="0" w:unhideWhenUsed="0"/>
+    <w:lsdException w:name="Colorful List Accent 2" w:uiPriority="72" w:semiHidden="0" w:unhideWhenUsed="0"/>
+    <w:lsdException w:name="Light Grid Accent 2" w:uiPriority="62" w:semiHidden="0" w:unhideWhenUsed="0"/>
+    <w:lsdException w:name="List Number" w:uiPriority="0" w:semiHidden="0" w:unhideWhenUsed="0"/>
+    <w:lsdException w:name="Medium Grid 2" w:uiPriority="68" w:semiHidden="0" w:unhideWhenUsed="0"/>
+    <w:lsdException w:name="toc 5" w:uiPriority="0" w:semiHidden="0" w:unhideWhenUsed="0"/>
+    <w:lsdException w:name="HTML Typewriter" w:uiPriority="0" w:semiHidden="0" w:unhideWhenUsed="0"/>
+    <w:lsdException w:name="Table Colorful 3" w:uiPriority="0" w:semiHidden="0" w:unhideWhenUsed="0"/>
+    <w:lsdException w:name="Medium List 2 Accent 5" w:uiPriority="66" w:semiHidden="0" w:unhideWhenUsed="0"/>
+    <w:lsdException w:name="index 6" w:uiPriority="0" w:semiHidden="0" w:unhideWhenUsed="0"/>
+    <w:lsdException w:name="heading 9" w:uiPriority="0" w:qFormat="1"/>
+    <w:lsdException w:name="Colorful List Accent 4" w:uiPriority="72" w:semiHidden="0" w:unhideWhenUsed="0"/>
+    <w:lsdException w:name="table of figures" w:uiPriority="0" w:semiHidden="0" w:unhideWhenUsed="0"/>
+    <w:lsdException w:name="Table Web 2" w:uiPriority="0" w:semiHidden="0" w:unhideWhenUsed="0"/>
+    <w:lsdException w:name="Light Grid Accent 6" w:uiPriority="62" w:semiHidden="0" w:unhideWhenUsed="0"/>
+    <w:lsdException w:name="Table List 7" w:uiPriority="0" w:semiHidden="0" w:unhideWhenUsed="0"/>
+    <w:lsdException w:name="Table Classic 4" w:uiPriority="0" w:semiHidden="0" w:unhideWhenUsed="0"/>
+    <w:lsdException w:name="endnote text" w:uiPriority="99" w:qFormat="1"/>
+    <w:lsdException w:name="HTML Code" w:uiPriority="0" w:semiHidden="0" w:unhideWhenUsed="0"/>
+    <w:lsdException w:name="Light Shading Accent 1" w:uiPriority="60" w:semiHidden="0" w:unhideWhenUsed="0"/>
+    <w:lsdException w:name="Signature" w:uiPriority="0" w:semiHidden="0" w:unhideWhenUsed="0"/>
+    <w:lsdException w:name="Table Colorful 1" w:uiPriority="0" w:semiHidden="0" w:unhideWhenUsed="0"/>
+    <w:lsdException w:name="heading 5" w:uiPriority="0" w:semiHidden="0" w:unhideWhenUsed="0" w:qFormat="1"/>
+    <w:lsdException w:name="E-mail Signature" w:uiPriority="0" w:semiHidden="0" w:unhideWhenUsed="0"/>
+    <w:lsdException w:name="annotation subject" w:uiPriority="0" w:semiHidden="0" w:unhideWhenUsed="0"/>
+    <w:lsdException w:name="toc 7" w:uiPriority="0" w:semiHidden="0" w:unhideWhenUsed="0"/>
+    <w:lsdException w:name="Medium Shading 1 Accent 5" w:uiPriority="63" w:semiHidden="0" w:unhideWhenUsed="0"/>
+    <w:lsdException w:name="Emphasis" w:uiPriority="0" w:semiHidden="0" w:unhideWhenUsed="0" w:qFormat="1"/>
+    <w:lsdException w:name="Colorful Grid Accent 5" w:uiPriority="73" w:semiHidden="0" w:unhideWhenUsed="0"/>
+    <w:lsdException w:name="Light Shading Accent 2" w:uiPriority="60" w:semiHidden="0" w:unhideWhenUsed="0"/>
+    <w:lsdException w:name="Table Classic 2" w:uiPriority="0" w:semiHidden="0" w:unhideWhenUsed="0"/>
+    <w:lsdException w:name="Table Columns 2" w:uiPriority="0" w:semiHidden="0" w:unhideWhenUsed="0"/>
+    <w:lsdException w:name="Medium List 2 Accent 6" w:uiPriority="66" w:semiHidden="0" w:unhideWhenUsed="0"/>
+    <w:lsdException w:name="Medium Grid 2 Accent 3" w:uiPriority="68" w:semiHidden="0" w:unhideWhenUsed="0"/>
+    <w:lsdException w:name="Light List Accent 2" w:uiPriority="61" w:semiHidden="0" w:unhideWhenUsed="0"/>
+    <w:lsdException w:name="index 5" w:uiPriority="0" w:semiHidden="0" w:unhideWhenUsed="0"/>
+    <w:lsdException w:name="Light Shading Accent 4" w:uiPriority="60" w:semiHidden="0" w:unhideWhenUsed="0"/>
+    <w:lsdException w:name="Medium Grid 1 Accent 1" w:uiPriority="67" w:semiHidden="0" w:unhideWhenUsed="0"/>
+    <w:lsdException w:name="Medium Grid 2 Accent 5" w:uiPriority="68" w:semiHidden="0" w:unhideWhenUsed="0"/>
+    <w:lsdException w:name="Medium Shading 2 Accent 4" w:uiPriority="64" w:semiHidden="0" w:unhideWhenUsed="0"/>
+    <w:lsdException w:name="Table Simple 2" w:uiPriority="0" w:semiHidden="0" w:unhideWhenUsed="0"/>
+    <w:lsdException w:name="annotation reference" w:uiPriority="0" w:semiHidden="0" w:unhideWhenUsed="0"/>
+    <w:lsdException w:name="List 2" w:uiPriority="0" w:semiHidden="0" w:unhideWhenUsed="0"/>
+    <w:lsdException w:name="Table Contemporary" w:uiPriority="0" w:semiHidden="0" w:unhideWhenUsed="0"/>
+    <w:lsdException w:name="Medium Grid 3 Accent 4" w:uiPriority="69" w:semiHidden="0" w:unhideWhenUsed="0"/>
+    <w:lsdException w:name="Medium Shading 2" w:uiPriority="64" w:semiHidden="0" w:unhideWhenUsed="0"/>
+    <w:lsdException w:name="Table 3D effects 3" w:uiPriority="0" w:semiHidden="0" w:unhideWhenUsed="0"/>
+    <w:lsdException w:name="macro" w:uiPriority="0" w:semiHidden="0" w:unhideWhenUsed="0"/>
+    <w:lsdException w:name="Colorful Grid Accent 3" w:uiPriority="73" w:semiHidden="0" w:unhideWhenUsed="0"/>
+    <w:lsdException w:name="Light List Accent 5" w:uiPriority="61" w:semiHidden="0" w:unhideWhenUsed="0"/>
+    <w:lsdException w:name="List Continue 2" w:uiPriority="0" w:semiHidden="0" w:unhideWhenUsed="0"/>
+    <w:lsdException w:name="List Number 3" w:uiPriority="0" w:semiHidden="0" w:unhideWhenUsed="0"/>
+    <w:lsdException w:name="Colorful List Accent 6" w:uiPriority="72" w:semiHidden="0" w:unhideWhenUsed="0"/>
+    <w:lsdException w:name="Table Grid 4" w:uiPriority="0" w:semiHidden="0" w:unhideWhenUsed="0"/>
+    <w:lsdException w:name="Body Text 2" w:uiPriority="0" w:semiHidden="0" w:unhideWhenUsed="0"/>
+    <w:lsdException w:name="Balloon Text" w:uiPriority="0" w:semiHidden="0" w:unhideWhenUsed="0"/>
+    <w:lsdException w:name="Medium Grid 1 Accent 3" w:uiPriority="67" w:semiHidden="0" w:unhideWhenUsed="0"/>
+    <w:lsdException w:name="Subtitle" w:uiPriority="0" w:semiHidden="0" w:unhideWhenUsed="0" w:qFormat="1"/>
+    <w:lsdException w:name="Table Elegant" w:uiPriority="0" w:semiHidden="0" w:unhideWhenUsed="0"/>
+    <w:lsdException w:name="toc 1" w:uiPriority="0" w:semiHidden="0" w:unhideWhenUsed="0"/>
+    <w:lsdException w:name="Medium Shading 1 Accent 3" w:uiPriority="63" w:semiHidden="0" w:unhideWhenUsed="0"/>
+    <w:lsdException w:name="Block Text" w:uiPriority="0" w:semiHidden="0" w:unhideWhenUsed="0"/>
+    <w:lsdException w:name="Medium Shading 1" w:uiPriority="63" w:semiHidden="0" w:unhideWhenUsed="0"/>
+    <w:lsdException w:name="Colorful Shading Accent 2" w:uiPriority="71" w:semiHidden="0" w:unhideWhenUsed="0"/>
+    <w:lsdException w:name="List Number 5" w:uiPriority="0" w:semiHidden="0" w:unhideWhenUsed="0"/>
+    <w:lsdException w:name="Table List 2" w:uiPriority="0" w:semiHidden="0" w:unhideWhenUsed="0"/>
+    <w:lsdException w:name="toc 9" w:uiPriority="0" w:semiHidden="0" w:unhideWhenUsed="0"/>
+    <w:lsdException w:name="Normal" w:uiPriority="0" w:semiHidden="0" w:unhideWhenUsed="0" w:qFormat="1"/>
+    <w:lsdException w:name="Medium List 1 Accent 4" w:uiPriority="65" w:semiHidden="0" w:unhideWhenUsed="0"/>
+    <w:lsdException w:name="Medium Grid 1" w:uiPriority="67" w:semiHidden="0" w:unhideWhenUsed="0"/>
+    <w:lsdException w:name="Colorful Shading Accent 4" w:uiPriority="71" w:semiHidden="0" w:unhideWhenUsed="0"/>
+    <w:lsdException w:name="HTML Preformatted" w:uiPriority="0" w:semiHidden="0" w:unhideWhenUsed="0"/>
+    <w:lsdException w:name="heading 1" w:uiPriority="0" w:semiHidden="0" w:unhideWhenUsed="0" w:qFormat="1"/>
+    <w:lsdException w:name="Table Grid" w:uiPriority="0" w:semiHidden="0" w:unhideWhenUsed="0"/>
+    <w:lsdException w:name="HTML Sample" w:uiPriority="0" w:semiHidden="0" w:unhideWhenUsed="0"/>
+    <w:lsdException w:name="Dark List Accent 5" w:uiPriority="70" w:semiHidden="0" w:unhideWhenUsed="0"/>
+    <w:lsdException w:name="Table Simple 1" w:uiPriority="0" w:semiHidden="0" w:unhideWhenUsed="0"/>
+    <w:lsdException w:name="Table List 4" w:uiPriority="0" w:semiHidden="0" w:unhideWhenUsed="0"/>
+    <w:lsdException w:name="toc 3" w:uiPriority="0" w:semiHidden="0" w:unhideWhenUsed="0"/>
+    <w:lsdException w:name="index 3" w:uiPriority="0" w:semiHidden="0" w:unhideWhenUsed="0"/>
+    <w:lsdException w:name="Body Text Indent 2" w:uiPriority="0" w:semiHidden="0" w:unhideWhenUsed="0"/>
+    <w:lsdException w:name="Medium Shading 1 Accent 1" w:uiPriority="63" w:semiHidden="0" w:unhideWhenUsed="0"/>
+    <w:lsdException w:name="Medium Grid 3 Accent 6" w:uiPriority="69" w:semiHidden="0" w:unhideWhenUsed="0"/>
+    <w:lsdException w:name="Light Grid Accent 4" w:uiPriority="62" w:semiHidden="0" w:unhideWhenUsed="0"/>
+    <w:lsdException w:name="Hyperlink" w:uiPriority="99" w:semiHidden="0" w:qFormat="1"/>
+    <w:lsdException w:name="List" w:uiPriority="0" w:semiHidden="0" w:unhideWhenUsed="0"/>
+    <w:lsdException w:name="Plain Text" w:uiPriority="0" w:semiHidden="0" w:unhideWhenUsed="0"/>
+    <w:lsdException w:name="HTML Acronym" w:uiPriority="0" w:semiHidden="0" w:unhideWhenUsed="0"/>
+    <w:lsdException w:name="Dark List Accent 1" w:uiPriority="70" w:semiHidden="0" w:unhideWhenUsed="0"/>
+    <w:lsdException w:name="Normal Indent" w:uiPriority="0" w:semiHidden="0" w:unhideWhenUsed="0"/>
+    <w:lsdException w:name="Table Subtle 1" w:uiPriority="0" w:semiHidden="0" w:unhideWhenUsed="0"/>
+    <w:lsdException w:name="footnote text" w:uiPriority="99" w:qFormat="1"/>
+    <w:lsdException w:name="Light Shading Accent 6" w:uiPriority="60" w:semiHidden="0" w:unhideWhenUsed="0"/>
+    <w:lsdException w:name="Normal (Web)" w:uiPriority="0" w:semiHidden="0" w:unhideWhenUsed="0"/>
+    <w:lsdException w:name="Light Shading" w:uiPriority="60" w:semiHidden="0" w:unhideWhenUsed="0"/>
+    <w:lsdException w:name="Colorful Shading" w:uiPriority="71" w:semiHidden="0" w:unhideWhenUsed="0"/>
+    <w:lsdException w:name="Body Text First Indent" w:uiPriority="0" w:semiHidden="0" w:unhideWhenUsed="0"/>
+    <w:lsdException w:name="Medium Shading 2 Accent 2" w:uiPriority="64" w:semiHidden="0" w:unhideWhenUsed="0"/>
+    <w:lsdException w:name="heading 3" w:uiPriority="0" w:semiHidden="0" w:unhideWhenUsed="0" w:qFormat="1"/>
+    <w:lsdException w:name="footer" w:uiPriority="0" w:semiHidden="0" w:unhideWhenUsed="0"/>
+    <w:lsdException w:name="Table Web 1" w:uiPriority="0" w:semiHidden="0" w:unhideWhenUsed="0"/>
+    <w:lsdException w:name="Medium List 2 Accent 2" w:uiPriority="66" w:semiHidden="0" w:unhideWhenUsed="0"/>
+    <w:lsdException w:name="Table 3D effects 1" w:uiPriority="0" w:semiHidden="0" w:unhideWhenUsed="0"/>
+    <w:lsdException w:name="index 1" w:uiPriority="0" w:semiHidden="0" w:unhideWhenUsed="0"/>
+    <w:lsdException w:name="Strong" w:uiPriority="0" w:semiHidden="0" w:unhideWhenUsed="0" w:qFormat="1"/>
+    <w:lsdException w:name="List Paragraph" w:uiPriority="0" w:semiHidden="0" w:unhideWhenUsed="0" w:qFormat="1"/>
+    <w:lsdException w:name="Light Grid Accent 3" w:uiPriority="62" w:semiHidden="0" w:unhideWhenUsed="0"/>
+    <w:lsdException w:name="Date" w:uiPriority="0" w:semiHidden="0" w:unhideWhenUsed="0"/>
+    <w:lsdException w:name="Medium Grid 2 Accent 1" w:uiPriority="68" w:semiHidden="0" w:unhideWhenUsed="0"/>
+    <w:lsdException w:name="Table Grid 6" w:uiPriority="0" w:semiHidden="0" w:unhideWhenUsed="0"/>
+    <w:lsdException w:name="Table Columns 5" w:uiPriority="0" w:semiHidden="0" w:unhideWhenUsed="0"/>
+    <w:lsdException w:name="table of authorities" w:uiPriority="0" w:semiHidden="0" w:unhideWhenUsed="0"/>
+    <w:lsdException w:name="Table Web 3" w:uiPriority="0" w:semiHidden="0" w:unhideWhenUsed="0"/>
     <w:lsdException w:name="Medium List 1 Accent 6" w:uiPriority="65" w:semiHidden="0" w:unhideWhenUsed="0"/>
-    <w:lsdException w:name="Colorful List Accent 5" w:uiPriority="72" w:semiHidden="0" w:unhideWhenUsed="0"/>
-    <w:lsdException w:name="toc 3" w:uiPriority="0" w:semiHidden="0" w:unhideWhenUsed="0"/>
-    <w:lsdException w:name="toc 2" w:uiPriority="0" w:semiHidden="0" w:unhideWhenUsed="0"/>
-    <w:lsdException w:name="Light Shading Accent 3" w:uiPriority="60" w:semiHidden="0" w:unhideWhenUsed="0"/>
-    <w:lsdException w:name="Body Text First Indent" w:uiPriority="0" w:semiHidden="0" w:unhideWhenUsed="0"/>
-    <w:lsdException w:name="Medium Grid 1 Accent 2" w:uiPriority="67" w:semiHidden="0" w:unhideWhenUsed="0"/>
+    <w:lsdException w:name="Medium Grid 1 Accent 6" w:uiPriority="67" w:semiHidden="0" w:unhideWhenUsed="0"/>
+    <w:lsdException w:name="Medium Grid 3" w:uiPriority="69" w:semiHidden="0" w:unhideWhenUsed="0"/>
+    <w:lsdException w:name="Light Grid" w:uiPriority="62" w:semiHidden="0" w:unhideWhenUsed="0"/>
+    <w:lsdException w:name="Colorful Shading Accent 6" w:uiPriority="71" w:semiHidden="0" w:unhideWhenUsed="0"/>
+    <w:lsdException w:name="Light List" w:uiPriority="61" w:semiHidden="0" w:unhideWhenUsed="0"/>
+    <w:lsdException w:name="Table List 6" w:uiPriority="0" w:semiHidden="0" w:unhideWhenUsed="0"/>
     <w:lsdException w:name="Light List Accent 1" w:uiPriority="61" w:semiHidden="0" w:unhideWhenUsed="0"/>
-    <w:lsdException w:name="Light Grid Accent 5" w:uiPriority="62" w:semiHidden="0" w:unhideWhenUsed="0"/>
-    <w:lsdException w:name="Table Colorful 3" w:uiPriority="0" w:semiHidden="0" w:unhideWhenUsed="0"/>
-    <w:lsdException w:name="Medium List 2 Accent 1" w:uiPriority="66" w:semiHidden="0" w:unhideWhenUsed="0"/>
-    <w:lsdException w:name="Colorful List Accent 2" w:uiPriority="72" w:semiHidden="0" w:unhideWhenUsed="0"/>
-    <w:lsdException w:name="HTML Sample" w:uiPriority="0" w:semiHidden="0" w:unhideWhenUsed="0"/>
-    <w:lsdException w:name="Medium Shading 2 Accent 4" w:uiPriority="64" w:semiHidden="0" w:unhideWhenUsed="0"/>
-    <w:lsdException w:name="endnote text" w:uiPriority="99" w:qFormat="1"/>
-    <w:lsdException w:name="Colorful Shading Accent 3" w:uiPriority="71" w:semiHidden="0" w:unhideWhenUsed="0"/>
-    <w:lsdException w:name="Light List Accent 5" w:uiPriority="61" w:semiHidden="0" w:unhideWhenUsed="0"/>
+    <w:lsdException w:name="List Bullet 4" w:uiPriority="0" w:semiHidden="0" w:unhideWhenUsed="0"/>
+    <w:lsdException w:name="Table Grid 1" w:uiPriority="0" w:semiHidden="0" w:unhideWhenUsed="0"/>
+    <w:lsdException w:name="Message Header" w:uiPriority="0" w:semiHidden="0" w:unhideWhenUsed="0"/>
+    <w:lsdException w:name="HTML Definition" w:uiPriority="0" w:semiHidden="0" w:unhideWhenUsed="0"/>
+    <w:lsdException w:name="toc 6" w:uiPriority="0" w:semiHidden="0" w:unhideWhenUsed="0"/>
+    <w:lsdException w:name="Medium Grid 2 Accent 2" w:uiPriority="68" w:semiHidden="0" w:unhideWhenUsed="0"/>
+    <w:lsdException w:name="Medium Shading 1 Accent 4" w:uiPriority="63" w:semiHidden="0" w:unhideWhenUsed="0"/>
+    <w:lsdException w:name="Light List Accent 4" w:uiPriority="61" w:semiHidden="0" w:unhideWhenUsed="0"/>
+    <w:lsdException w:name="Medium List 2 Accent 4" w:uiPriority="66" w:semiHidden="0" w:unhideWhenUsed="0"/>
+    <w:lsdException w:name="Light List Accent 3" w:uiPriority="61" w:semiHidden="0" w:unhideWhenUsed="0"/>
+    <w:lsdException w:name="index 7" w:uiPriority="0" w:semiHidden="0" w:unhideWhenUsed="0"/>
+    <w:lsdException w:name="List 4" w:uiPriority="0" w:semiHidden="0" w:unhideWhenUsed="0"/>
     <w:lsdException w:name="Medium Grid 3 Accent 2" w:uiPriority="69" w:semiHidden="0" w:unhideWhenUsed="0"/>
     <w:lsdException w:name="Medium Shading 2 Accent 6" w:uiPriority="64" w:semiHidden="0" w:unhideWhenUsed="0"/>
+    <w:lsdException w:name="Medium List 1 Accent 1" w:uiPriority="65" w:semiHidden="0" w:unhideWhenUsed="0"/>
+    <w:lsdException w:name="List Bullet 2" w:uiPriority="0" w:semiHidden="0" w:unhideWhenUsed="0"/>
+    <w:lsdException w:name="Table Grid 3" w:uiPriority="0" w:semiHidden="0" w:unhideWhenUsed="0"/>
+    <w:lsdException w:name="Colorful Shading Accent 1" w:uiPriority="71" w:semiHidden="0" w:unhideWhenUsed="0"/>
+    <w:lsdException w:name="heading 6" w:uiPriority="0" w:semiHidden="0" w:unhideWhenUsed="0" w:qFormat="1"/>
+    <w:lsdException w:name="List Number 2" w:uiPriority="0" w:semiHidden="0" w:unhideWhenUsed="0"/>
+    <w:lsdException w:name="List 3" w:uiPriority="0" w:semiHidden="0" w:unhideWhenUsed="0"/>
     <w:lsdException w:name="Table List 1" w:uiPriority="0" w:semiHidden="0" w:unhideWhenUsed="0"/>
-    <w:lsdException w:name="Medium Grid 3 Accent 6" w:uiPriority="69" w:semiHidden="0" w:unhideWhenUsed="0"/>
-    <w:lsdException w:name="Table Grid 3" w:uiPriority="0" w:semiHidden="0" w:unhideWhenUsed="0"/>
-    <w:lsdException w:name="annotation reference" w:uiPriority="0" w:semiHidden="0" w:unhideWhenUsed="0"/>
-    <w:lsdException w:name="List Number 3" w:uiPriority="0" w:semiHidden="0" w:unhideWhenUsed="0"/>
-    <w:lsdException w:name="Medium Grid 2 Accent 5" w:uiPriority="68" w:semiHidden="0" w:unhideWhenUsed="0"/>
-    <w:lsdException w:name="List 2" w:uiPriority="0" w:semiHidden="0" w:unhideWhenUsed="0"/>
-    <w:lsdException w:name="Medium List 1 Accent 2" w:uiPriority="65" w:semiHidden="0" w:unhideWhenUsed="0"/>
-    <w:lsdException w:name="List Continue 2" w:uiPriority="0" w:semiHidden="0" w:unhideWhenUsed="0"/>
-    <w:lsdException w:name="heading 3" w:uiPriority="0" w:semiHidden="0" w:unhideWhenUsed="0" w:qFormat="1"/>
+    <w:lsdException w:name="toc 8" w:uiPriority="0" w:semiHidden="0" w:unhideWhenUsed="0"/>
+    <w:lsdException w:name="envelope address" w:uiPriority="0" w:semiHidden="0" w:unhideWhenUsed="0"/>
+    <w:lsdException w:name="Light Grid Accent 1" w:uiPriority="62" w:semiHidden="0" w:unhideWhenUsed="0"/>
+    <w:lsdException w:name="Colorful Grid Accent 1" w:uiPriority="73" w:semiHidden="0" w:unhideWhenUsed="0"/>
+    <w:lsdException w:name="Medium List 1 Accent 3" w:uiPriority="65" w:semiHidden="0" w:unhideWhenUsed="0"/>
+    <w:lsdException w:name="FollowedHyperlink" w:uiPriority="0" w:semiHidden="0" w:unhideWhenUsed="0"/>
+    <w:lsdException w:name="List Bullet 3" w:uiPriority="0" w:semiHidden="0" w:unhideWhenUsed="0"/>
+    <w:lsdException w:name="Table Classic 3" w:uiPriority="0" w:semiHidden="0" w:unhideWhenUsed="0"/>
+    <w:lsdException w:name="Table Colorful 2" w:uiPriority="0" w:semiHidden="0" w:unhideWhenUsed="0"/>
+    <w:lsdException w:name="Table Columns 1" w:uiPriority="0" w:semiHidden="0" w:unhideWhenUsed="0"/>
+    <w:lsdException w:name="Medium Grid 3 Accent 1" w:uiPriority="69" w:semiHidden="0" w:unhideWhenUsed="0"/>
+    <w:lsdException w:name="Colorful Shading Accent 3" w:uiPriority="71" w:semiHidden="0" w:unhideWhenUsed="0"/>
+    <w:lsdException w:name="heading 8" w:uiPriority="0" w:qFormat="1"/>
+    <w:lsdException w:name="Colorful List Accent 3" w:uiPriority="72" w:semiHidden="0" w:unhideWhenUsed="0"/>
+    <w:lsdException w:name="List Bullet" w:uiPriority="0" w:semiHidden="0" w:unhideWhenUsed="0"/>
+    <w:lsdException w:name="Medium List 1" w:uiPriority="65" w:semiHidden="0" w:unhideWhenUsed="0"/>
+    <w:lsdException w:name="Table List 3" w:uiPriority="0" w:semiHidden="0" w:unhideWhenUsed="0"/>
+    <w:lsdException w:name="index 9" w:uiPriority="0" w:semiHidden="0" w:unhideWhenUsed="0"/>
+    <w:lsdException w:name="Colorful Grid Accent 2" w:uiPriority="73" w:semiHidden="0" w:unhideWhenUsed="0"/>
+    <w:lsdException w:name="page number" w:uiPriority="0" w:semiHidden="0" w:unhideWhenUsed="0"/>
+    <w:lsdException w:name="Salutation" w:uiPriority="0" w:semiHidden="0" w:unhideWhenUsed="0"/>
+    <w:lsdException w:name="Body Text First Indent 2" w:uiPriority="0" w:semiHidden="0" w:unhideWhenUsed="0"/>
+    <w:lsdException w:name="Table Classic 1" w:uiPriority="0" w:semiHidden="0" w:unhideWhenUsed="0"/>
+    <w:lsdException w:name="footnote reference" w:uiPriority="99" w:qFormat="1"/>
+    <w:lsdException w:name="Medium Grid 2 Accent 4" w:uiPriority="68" w:semiHidden="0" w:unhideWhenUsed="0"/>
     <w:lsdException w:name="Medium Shading 2 Accent 3" w:uiPriority="64" w:semiHidden="0" w:unhideWhenUsed="0"/>
-    <w:lsdException w:name="Table List 8" w:uiPriority="0" w:semiHidden="0" w:unhideWhenUsed="0"/>
-    <w:lsdException w:name="Colorful Shading" w:uiPriority="71" w:semiHidden="0" w:unhideWhenUsed="0"/>
-    <w:lsdException w:name="Table List 5" w:uiPriority="0" w:semiHidden="0" w:unhideWhenUsed="0"/>
-    <w:lsdException w:name="HTML Acronym" w:uiPriority="0" w:semiHidden="0" w:unhideWhenUsed="0"/>
-    <w:lsdException w:name="Table Columns 5" w:uiPriority="0" w:semiHidden="0" w:unhideWhenUsed="0"/>
-    <w:lsdException w:name="toc 6" w:uiPriority="0" w:semiHidden="0" w:unhideWhenUsed="0"/>
-    <w:lsdException w:name="Light Shading Accent 6" w:uiPriority="60" w:semiHidden="0" w:unhideWhenUsed="0"/>
-    <w:lsdException w:name="Hyperlink" w:uiPriority="99" w:semiHidden="0" w:qFormat="1"/>
-    <w:lsdException w:name="table of authorities" w:uiPriority="0" w:semiHidden="0" w:unhideWhenUsed="0"/>
-    <w:lsdException w:name="heading 1" w:uiPriority="0" w:semiHidden="0" w:unhideWhenUsed="0" w:qFormat="1"/>
-    <w:lsdException w:name="Medium List 2 Accent 4" w:uiPriority="66" w:semiHidden="0" w:unhideWhenUsed="0"/>
-    <w:lsdException w:name="Medium Grid 3" w:uiPriority="69" w:semiHidden="0" w:unhideWhenUsed="0"/>
-    <w:lsdException w:name="Medium Shading 1 Accent 1" w:uiPriority="63" w:semiHidden="0" w:unhideWhenUsed="0"/>
-    <w:lsdException w:name="Dark List Accent 3" w:uiPriority="70" w:semiHidden="0" w:unhideWhenUsed="0"/>
-    <w:lsdException w:name="Closing" w:uiPriority="0" w:semiHidden="0" w:unhideWhenUsed="0"/>
-    <w:lsdException w:name="Table Simple 1" w:uiPriority="0" w:semiHidden="0" w:unhideWhenUsed="0"/>
-    <w:lsdException w:name="heading 4" w:uiPriority="0" w:semiHidden="0" w:unhideWhenUsed="0" w:qFormat="1"/>
-    <w:lsdException w:name="Balloon Text" w:uiPriority="0" w:semiHidden="0" w:unhideWhenUsed="0"/>
-    <w:lsdException w:name="Colorful List" w:uiPriority="72" w:semiHidden="0" w:unhideWhenUsed="0"/>
-    <w:lsdException w:name="Medium Shading 1 Accent 3" w:uiPriority="63" w:semiHidden="0" w:unhideWhenUsed="0"/>
-    <w:lsdException w:name="index 8" w:uiPriority="0" w:semiHidden="0" w:unhideWhenUsed="0"/>
-    <w:lsdException w:name="Table Subtle 1" w:uiPriority="0" w:semiHidden="0" w:unhideWhenUsed="0"/>
-    <w:lsdException w:name="Medium List 1 Accent 1" w:uiPriority="65" w:semiHidden="0" w:unhideWhenUsed="0"/>
-    <w:lsdException w:name="Table Classic 1" w:uiPriority="0" w:semiHidden="0" w:unhideWhenUsed="0"/>
-    <w:lsdException w:name="toc 5" w:uiPriority="0" w:semiHidden="0" w:unhideWhenUsed="0"/>
-    <w:lsdException w:name="Colorful List Accent 1" w:uiPriority="72" w:semiHidden="0" w:unhideWhenUsed="0"/>
-    <w:lsdException w:name="Medium Shading 1 Accent 5" w:uiPriority="63" w:semiHidden="0" w:unhideWhenUsed="0"/>
-    <w:lsdException w:name="Medium Shading 1 Accent 6" w:uiPriority="63" w:semiHidden="0" w:unhideWhenUsed="0"/>
-    <w:lsdException w:name="Colorful Shading Accent 6" w:uiPriority="71" w:semiHidden="0" w:unhideWhenUsed="0"/>
-    <w:lsdException w:name="Table Contemporary" w:uiPriority="0" w:semiHidden="0" w:unhideWhenUsed="0"/>
-    <w:lsdException w:name="Table Grid 6" w:uiPriority="0" w:semiHidden="0" w:unhideWhenUsed="0"/>
-    <w:lsdException w:name="Medium Grid 1" w:uiPriority="67" w:semiHidden="0" w:unhideWhenUsed="0"/>
-    <w:lsdException w:name="toc 8" w:uiPriority="0" w:semiHidden="0" w:unhideWhenUsed="0"/>
-    <w:lsdException w:name="List Continue" w:uiPriority="0" w:semiHidden="0" w:unhideWhenUsed="0"/>
-    <w:lsdException w:name="Medium Grid 2 Accent 1" w:uiPriority="68" w:semiHidden="0" w:unhideWhenUsed="0"/>
-    <w:lsdException w:name="List Continue 3" w:uiPriority="0" w:semiHidden="0" w:unhideWhenUsed="0"/>
-    <w:lsdException w:name="Medium List 2 Accent 6" w:uiPriority="66" w:semiHidden="0" w:unhideWhenUsed="0"/>
-    <w:lsdException w:name="Salutation" w:uiPriority="0" w:semiHidden="0" w:unhideWhenUsed="0"/>
-    <w:lsdException w:name="Light Grid Accent 1" w:uiPriority="62" w:semiHidden="0" w:unhideWhenUsed="0"/>
-    <w:lsdException w:name="Table Colorful 1" w:uiPriority="0" w:semiHidden="0" w:unhideWhenUsed="0"/>
-    <w:lsdException w:name="Medium Shading 2 Accent 2" w:uiPriority="64" w:semiHidden="0" w:unhideWhenUsed="0"/>
-    <w:lsdException w:name="index 1" w:uiPriority="0" w:semiHidden="0" w:unhideWhenUsed="0"/>
-    <w:lsdException w:name="line number" w:uiPriority="0" w:semiHidden="0" w:unhideWhenUsed="0"/>
-    <w:lsdException w:name="Colorful Grid Accent 2" w:uiPriority="73" w:semiHidden="0" w:unhideWhenUsed="0"/>
-    <w:lsdException w:name="Colorful Grid" w:uiPriority="73" w:semiHidden="0" w:unhideWhenUsed="0"/>
-    <w:lsdException w:name="Medium Grid 3 Accent 1" w:uiPriority="69" w:semiHidden="0" w:unhideWhenUsed="0"/>
-    <w:lsdException w:name="Colorful List Accent 3" w:uiPriority="72" w:semiHidden="0" w:unhideWhenUsed="0"/>
-    <w:lsdException w:name="Dark List Accent 1" w:uiPriority="70" w:semiHidden="0" w:unhideWhenUsed="0"/>
-    <w:lsdException w:name="HTML Preformatted" w:uiPriority="0" w:semiHidden="0" w:unhideWhenUsed="0"/>
-    <w:lsdException w:name="List Bullet" w:uiPriority="0" w:semiHidden="0" w:unhideWhenUsed="0"/>
-    <w:lsdException w:name="HTML Address" w:uiPriority="0" w:semiHidden="0" w:unhideWhenUsed="0"/>
-    <w:lsdException w:name="Light List" w:uiPriority="61" w:semiHidden="0" w:unhideWhenUsed="0"/>
-    <w:lsdException w:name="Medium List 1 Accent 5" w:uiPriority="65" w:semiHidden="0" w:unhideWhenUsed="0"/>
-    <w:lsdException w:name="Block Text" w:uiPriority="0" w:semiHidden="0" w:unhideWhenUsed="0"/>
-    <w:lsdException w:name="index 4" w:uiPriority="0" w:semiHidden="0" w:unhideWhenUsed="0"/>
-    <w:lsdException w:name="footnote reference" w:uiPriority="99" w:qFormat="1"/>
-    <w:lsdException w:name="heading 5" w:uiPriority="0" w:semiHidden="0" w:unhideWhenUsed="0" w:qFormat="1"/>
-    <w:lsdException w:name="Normal Table" w:uiPriority="0" w:unhideWhenUsed="0" w:qFormat="1"/>
-    <w:lsdException w:name="annotation subject" w:uiPriority="0" w:semiHidden="0" w:unhideWhenUsed="0"/>
-    <w:lsdException w:name="Medium List 1 Accent 3" w:uiPriority="65" w:semiHidden="0" w:unhideWhenUsed="0"/>
-    <w:lsdException w:name="macro" w:uiPriority="0" w:semiHidden="0" w:unhideWhenUsed="0"/>
-    <w:lsdException w:name="Medium List 1 Accent 4" w:uiPriority="65" w:semiHidden="0" w:unhideWhenUsed="0"/>
-    <w:lsdException w:name="footnote text" w:uiPriority="99" w:qFormat="1"/>
-    <w:lsdException w:name="Medium List 2 Accent 3" w:uiPriority="66" w:semiHidden="0" w:unhideWhenUsed="0"/>
-    <w:lsdException w:name="Medium Grid 2 Accent 4" w:uiPriority="68" w:semiHidden="0" w:unhideWhenUsed="0"/>
-    <w:lsdException w:name="toc 7" w:uiPriority="0" w:semiHidden="0" w:unhideWhenUsed="0"/>
-    <w:lsdException w:name="Plain Text" w:uiPriority="0" w:semiHidden="0" w:unhideWhenUsed="0"/>
-    <w:lsdException w:name="List 5" w:uiPriority="0" w:semiHidden="0" w:unhideWhenUsed="0"/>
+    <w:lsdException w:name="Default Paragraph Font" w:uiPriority="0" w:unhideWhenUsed="0" w:qFormat="1"/>
     <w:lsdException w:name="Table Subtle 2" w:uiPriority="0" w:semiHidden="0" w:unhideWhenUsed="0"/>
-    <w:lsdException w:name="heading 8" w:uiPriority="0" w:qFormat="1"/>
-    <w:lsdException w:name="endnote reference" w:uiPriority="99" w:qFormat="1"/>
-    <w:lsdException w:name="Table List 3" w:uiPriority="0" w:semiHidden="0" w:unhideWhenUsed="0"/>
-    <w:lsdException w:name="Subtitle" w:uiPriority="0" w:semiHidden="0" w:unhideWhenUsed="0" w:qFormat="1"/>
-    <w:lsdException w:name="Table Classic 3" w:uiPriority="0" w:semiHidden="0" w:unhideWhenUsed="0"/>
-    <w:lsdException w:name="toa heading" w:uiPriority="0" w:semiHidden="0" w:unhideWhenUsed="0"/>
-    <w:lsdException w:name="Medium Grid 2" w:uiPriority="68" w:semiHidden="0" w:unhideWhenUsed="0"/>
-    <w:lsdException w:name="Table Columns 2" w:uiPriority="0" w:semiHidden="0" w:unhideWhenUsed="0"/>
-    <w:lsdException w:name="toc 1" w:uiPriority="0" w:semiHidden="0" w:unhideWhenUsed="0"/>
-    <w:lsdException w:name="Default Paragraph Font" w:uiPriority="0" w:unhideWhenUsed="0" w:qFormat="1"/>
-    <w:lsdException w:name="HTML Definition" w:uiPriority="0" w:semiHidden="0" w:unhideWhenUsed="0"/>
-    <w:lsdException w:name="Medium Grid 1 Accent 1" w:uiPriority="67" w:semiHidden="0" w:unhideWhenUsed="0"/>
-    <w:lsdException w:name="List Bullet 2" w:uiPriority="0" w:semiHidden="0" w:unhideWhenUsed="0"/>
-    <w:lsdException w:name="Colorful List Accent 6" w:uiPriority="72" w:semiHidden="0" w:unhideWhenUsed="0"/>
-    <w:lsdException w:name="Dark List Accent 4" w:uiPriority="70" w:semiHidden="0" w:unhideWhenUsed="0"/>
-    <w:lsdException w:name="Table Columns 3" w:uiPriority="0" w:semiHidden="0" w:unhideWhenUsed="0"/>
-    <w:lsdException w:name="Dark List Accent 5" w:uiPriority="70" w:semiHidden="0" w:unhideWhenUsed="0"/>
-    <w:lsdException w:name="Colorful Grid Accent 1" w:uiPriority="73" w:semiHidden="0" w:unhideWhenUsed="0"/>
-    <w:lsdException w:name="Table Professional" w:uiPriority="0" w:semiHidden="0" w:unhideWhenUsed="0"/>
-    <w:lsdException w:name="Light Grid Accent 4" w:uiPriority="62" w:semiHidden="0" w:unhideWhenUsed="0"/>
-    <w:lsdException w:name="index 9" w:uiPriority="0" w:semiHidden="0" w:unhideWhenUsed="0"/>
-    <w:lsdException w:name="List Paragraph" w:uiPriority="0" w:semiHidden="0" w:unhideWhenUsed="0" w:qFormat="1"/>
-    <w:lsdException w:name="Medium Grid 2 Accent 2" w:uiPriority="68" w:semiHidden="0" w:unhideWhenUsed="0"/>
-    <w:lsdException w:name="Normal" w:uiPriority="0" w:semiHidden="0" w:unhideWhenUsed="0" w:qFormat="1"/>
-    <w:lsdException w:name="page number" w:uiPriority="0" w:semiHidden="0" w:unhideWhenUsed="0"/>
-    <w:lsdException w:name="Medium Grid 1 Accent 4" w:uiPriority="67" w:semiHidden="0" w:unhideWhenUsed="0"/>
-    <w:lsdException w:name="Light List Accent 6" w:uiPriority="61" w:semiHidden="0" w:unhideWhenUsed="0"/>
-    <w:lsdException w:name="Colorful Grid Accent 4" w:uiPriority="73" w:semiHidden="0" w:unhideWhenUsed="0"/>
-    <w:lsdException w:name="Table Grid" w:uiPriority="0" w:semiHidden="0" w:unhideWhenUsed="0"/>
-    <w:lsdException w:name="Medium Grid 3 Accent 4" w:uiPriority="69" w:semiHidden="0" w:unhideWhenUsed="0"/>
-    <w:lsdException w:name="Table List 6" w:uiPriority="0" w:semiHidden="0" w:unhideWhenUsed="0"/>
-    <w:lsdException w:name="Body Text Indent" w:uiPriority="0" w:semiHidden="0" w:unhideWhenUsed="0"/>
-    <w:lsdException w:name="Table Web 3" w:uiPriority="0" w:semiHidden="0" w:unhideWhenUsed="0"/>
-    <w:lsdException w:name="Medium List 2" w:uiPriority="66" w:semiHidden="0" w:unhideWhenUsed="0"/>
-    <w:lsdException w:name="E-mail Signature" w:uiPriority="0" w:semiHidden="0" w:unhideWhenUsed="0"/>
-    <w:lsdException w:name="heading 9" w:uiPriority="0" w:qFormat="1"/>
-    <w:lsdException w:name="Colorful Shading Accent 4" w:uiPriority="71" w:semiHidden="0" w:unhideWhenUsed="0"/>
-    <w:lsdException w:name="Medium Grid 1 Accent 6" w:uiPriority="67" w:semiHidden="0" w:unhideWhenUsed="0"/>
-    <w:lsdException w:name="Body Text Indent 2" w:uiPriority="0" w:semiHidden="0" w:unhideWhenUsed="0"/>
-    <w:lsdException w:name="Table Grid 4" w:uiPriority="0" w:semiHidden="0" w:unhideWhenUsed="0"/>
-    <w:lsdException w:name="Body Text 3" w:uiPriority="0" w:semiHidden="0" w:unhideWhenUsed="0"/>
-    <w:lsdException w:name="Medium Shading 1" w:uiPriority="63" w:semiHidden="0" w:unhideWhenUsed="0"/>
-    <w:lsdException w:name="Colorful Grid Accent 3" w:uiPriority="73" w:semiHidden="0" w:unhideWhenUsed="0"/>
-    <w:lsdException w:name="Light Shading" w:uiPriority="60" w:semiHidden="0" w:unhideWhenUsed="0"/>
     <w:lsdException w:name="Document Map" w:uiPriority="0" w:semiHidden="0" w:unhideWhenUsed="0"/>
-    <w:lsdException w:name="Light Shading Accent 4" w:uiPriority="60" w:semiHidden="0" w:unhideWhenUsed="0"/>
-    <w:lsdException w:name="Normal Indent" w:uiPriority="0" w:semiHidden="0" w:unhideWhenUsed="0"/>
-    <w:lsdException w:name="envelope return" w:uiPriority="0" w:semiHidden="0" w:unhideWhenUsed="0"/>
-    <w:lsdException w:name="HTML Code" w:uiPriority="0" w:semiHidden="0" w:unhideWhenUsed="0"/>
-    <w:lsdException w:name="Table 3D effects 1" w:uiPriority="0" w:semiHidden="0" w:unhideWhenUsed="0"/>
-    <w:lsdException w:name="Medium Shading 1 Accent 2" w:uiPriority="63" w:semiHidden="0" w:unhideWhenUsed="0"/>
-    <w:lsdException w:name="Body Text First Indent 2" w:uiPriority="0" w:semiHidden="0" w:unhideWhenUsed="0"/>
-    <w:lsdException w:name="toc 9" w:uiPriority="0" w:semiHidden="0" w:unhideWhenUsed="0"/>
-    <w:lsdException w:name="Table Simple 2" w:uiPriority="0" w:semiHidden="0" w:unhideWhenUsed="0"/>
-    <w:lsdException w:name="Colorful Shading Accent 2" w:uiPriority="71" w:semiHidden="0" w:unhideWhenUsed="0"/>
-    <w:lsdException w:name="Medium Grid 1 Accent 5" w:uiPriority="67" w:semiHidden="0" w:unhideWhenUsed="0"/>
-    <w:lsdException w:name="Title" w:uiPriority="0" w:semiHidden="0" w:unhideWhenUsed="0" w:qFormat="1"/>
-    <w:lsdException w:name="Table Web 2" w:uiPriority="0" w:semiHidden="0" w:unhideWhenUsed="0"/>
-    <w:lsdException w:name="Message Header" w:uiPriority="0" w:semiHidden="0" w:unhideWhenUsed="0"/>
-    <w:lsdException w:name="header" w:uiPriority="0" w:semiHidden="0" w:unhideWhenUsed="0"/>
-    <w:lsdException w:name="List Bullet 4" w:uiPriority="0" w:semiHidden="0" w:unhideWhenUsed="0"/>
-    <w:lsdException w:name="List Bullet 5" w:uiPriority="0" w:semiHidden="0" w:unhideWhenUsed="0"/>
-    <w:lsdException w:name="Table Classic 2" w:uiPriority="0" w:semiHidden="0" w:unhideWhenUsed="0"/>
-    <w:lsdException w:name="Medium List 2 Accent 2" w:uiPriority="66" w:semiHidden="0" w:unhideWhenUsed="0"/>
-    <w:lsdException w:name="Table Grid 5" w:uiPriority="0" w:semiHidden="0" w:unhideWhenUsed="0"/>
-    <w:lsdException w:name="Table Columns 4" w:uiPriority="0" w:semiHidden="0" w:unhideWhenUsed="0"/>
-    <w:lsdException w:name="Light Grid Accent 6" w:uiPriority="62" w:semiHidden="0" w:unhideWhenUsed="0"/>
-    <w:lsdException w:name="Normal (Web)" w:uiPriority="0" w:semiHidden="0" w:unhideWhenUsed="0"/>
-    <w:lsdException w:name="Table Colorful 2" w:uiPriority="0" w:semiHidden="0" w:unhideWhenUsed="0"/>
-    <w:lsdException w:name="Colorful Grid Accent 6" w:uiPriority="73" w:semiHidden="0" w:unhideWhenUsed="0"/>
-    <w:lsdException w:name="index 6" w:uiPriority="0" w:semiHidden="0" w:unhideWhenUsed="0"/>
-    <w:lsdException w:name="index 2" w:uiPriority="0" w:semiHidden="0" w:unhideWhenUsed="0"/>
-    <w:lsdException w:name="Body Text 2" w:uiPriority="0" w:semiHidden="0" w:unhideWhenUsed="0"/>
-    <w:lsdException w:name="Medium Shading 2" w:uiPriority="64" w:semiHidden="0" w:unhideWhenUsed="0"/>
-    <w:lsdException w:name="Medium List 2 Accent 5" w:uiPriority="66" w:semiHidden="0" w:unhideWhenUsed="0"/>
-    <w:lsdException w:name="Medium Grid 2 Accent 6" w:uiPriority="68" w:semiHidden="0" w:unhideWhenUsed="0"/>
-    <w:lsdException w:name="Light Grid Accent 3" w:uiPriority="62" w:semiHidden="0" w:unhideWhenUsed="0"/>
-    <w:lsdException w:name="List Number 4" w:uiPriority="0" w:semiHidden="0" w:unhideWhenUsed="0"/>
-    <w:lsdException w:name="Medium Shading 2 Accent 5" w:uiPriority="64" w:semiHidden="0" w:unhideWhenUsed="0"/>
-    <w:lsdException w:name="Medium Grid 3 Accent 3" w:uiPriority="69" w:semiHidden="0" w:unhideWhenUsed="0"/>
-    <w:lsdException w:name="Light Shading Accent 5" w:uiPriority="60" w:semiHidden="0" w:unhideWhenUsed="0"/>
-    <w:lsdException w:name="Medium Grid 3 Accent 5" w:uiPriority="69" w:semiHidden="0" w:unhideWhenUsed="0"/>
-    <w:lsdException w:name="HTML Cite" w:uiPriority="0" w:semiHidden="0" w:unhideWhenUsed="0"/>
-    <w:lsdException w:name="footer" w:uiPriority="0" w:semiHidden="0" w:unhideWhenUsed="0"/>
-    <w:lsdException w:name="Emphasis" w:uiPriority="0" w:semiHidden="0" w:unhideWhenUsed="0" w:qFormat="1"/>
-    <w:lsdException w:name="Table Grid 7" w:uiPriority="0" w:semiHidden="0" w:unhideWhenUsed="0"/>
-    <w:lsdException w:name="Table List 7" w:uiPriority="0" w:semiHidden="0" w:unhideWhenUsed="0"/>
-    <w:lsdException w:name="Light List Accent 4" w:uiPriority="61" w:semiHidden="0" w:unhideWhenUsed="0"/>
-    <w:lsdException w:name="List 4" w:uiPriority="0" w:semiHidden="0" w:unhideWhenUsed="0"/>
-    <w:lsdException w:name="envelope address" w:uiPriority="0" w:semiHidden="0" w:unhideWhenUsed="0"/>
-    <w:lsdException w:name="Table Columns 1" w:uiPriority="0" w:semiHidden="0" w:unhideWhenUsed="0"/>
-    <w:lsdException w:name="Body Text Indent 3" w:uiPriority="0" w:semiHidden="0" w:unhideWhenUsed="0"/>
-    <w:lsdException w:name="index 7" w:uiPriority="0" w:semiHidden="0" w:unhideWhenUsed="0"/>
-    <w:lsdException w:name="Light Shading Accent 2" w:uiPriority="60" w:semiHidden="0" w:unhideWhenUsed="0"/>
-    <w:lsdException w:name="Table 3D effects 2" w:uiPriority="0" w:semiHidden="0" w:unhideWhenUsed="0"/>
-    <w:lsdException w:name="Table List 4" w:uiPriority="0" w:semiHidden="0" w:unhideWhenUsed="0"/>
-    <w:lsdException w:name="List Number 5" w:uiPriority="0" w:semiHidden="0" w:unhideWhenUsed="0"/>
-    <w:lsdException w:name="HTML Keyboard" w:uiPriority="0" w:semiHidden="0" w:unhideWhenUsed="0"/>
-    <w:lsdException w:name="Colorful Shading Accent 1" w:uiPriority="71" w:semiHidden="0" w:unhideWhenUsed="0"/>
-    <w:lsdException w:name="annotation text" w:uiPriority="0" w:semiHidden="0" w:unhideWhenUsed="0"/>
-    <w:lsdException w:name="heading 7" w:uiPriority="0" w:qFormat="1"/>
-    <w:lsdException w:name="Table Grid 1" w:uiPriority="0" w:semiHidden="0" w:unhideWhenUsed="0"/>
-    <w:lsdException w:name="Table Web 1" w:uiPriority="0" w:semiHidden="0" w:unhideWhenUsed="0"/>
-    <w:lsdException w:name="Dark List" w:uiPriority="70" w:semiHidden="0" w:unhideWhenUsed="0"/>
-    <w:lsdException w:name="toc 4" w:uiPriority="0" w:semiHidden="0" w:unhideWhenUsed="0"/>
-    <w:lsdException w:name="Light Grid Accent 2" w:uiPriority="62" w:semiHidden="0" w:unhideWhenUsed="0"/>
-    <w:lsdException w:name="Dark List Accent 2" w:uiPriority="70" w:semiHidden="0" w:unhideWhenUsed="0"/>
-    <w:lsdException w:name="Light Grid" w:uiPriority="62" w:semiHidden="0" w:unhideWhenUsed="0"/>
-    <w:lsdException w:name="List" w:uiPriority="0" w:semiHidden="0" w:unhideWhenUsed="0"/>
-    <w:lsdException w:name="List Continue 4" w:uiPriority="0" w:semiHidden="0" w:unhideWhenUsed="0"/>
-    <w:lsdException w:name="List Bullet 3" w:uiPriority="0" w:semiHidden="0" w:unhideWhenUsed="0"/>
-    <w:lsdException w:name="Table Classic 4" w:uiPriority="0" w:semiHidden="0" w:unhideWhenUsed="0"/>
-    <w:lsdException w:name="Light List Accent 2" w:uiPriority="61" w:semiHidden="0" w:unhideWhenUsed="0"/>
-    <w:lsdException w:name="Light List Accent 3" w:uiPriority="61" w:semiHidden="0" w:unhideWhenUsed="0"/>
-    <w:lsdException w:name="Table Theme" w:uiPriority="0" w:semiHidden="0" w:unhideWhenUsed="0"/>
-    <w:lsdException w:name="Colorful List Accent 4" w:uiPriority="72" w:semiHidden="0" w:unhideWhenUsed="0"/>
-    <w:lsdException w:name="Table Grid 2" w:uiPriority="0" w:semiHidden="0" w:unhideWhenUsed="0"/>
-    <w:lsdException w:name="FollowedHyperlink" w:uiPriority="0" w:semiHidden="0" w:unhideWhenUsed="0"/>
-    <w:lsdException w:name="Colorful Grid Accent 5" w:uiPriority="73" w:semiHidden="0" w:unhideWhenUsed="0"/>
-    <w:lsdException w:name="Dark List Accent 6" w:uiPriority="70" w:semiHidden="0" w:unhideWhenUsed="0"/>
-    <w:lsdException w:name="table of figures" w:uiPriority="0" w:semiHidden="0" w:unhideWhenUsed="0"/>
-    <w:lsdException w:name="Colorful Shading Accent 5" w:uiPriority="71" w:semiHidden="0" w:unhideWhenUsed="0"/>
-    <w:lsdException w:name="index 5" w:uiPriority="0" w:semiHidden="0" w:unhideWhenUsed="0"/>
-    <w:lsdException w:name="HTML Variable" w:uiPriority="0" w:semiHidden="0" w:unhideWhenUsed="0"/>
-    <w:lsdException w:name="Medium Shading 2 Accent 1" w:uiPriority="64" w:semiHidden="0" w:unhideWhenUsed="0"/>
-    <w:lsdException w:name="Table 3D effects 3" w:uiPriority="0" w:semiHidden="0" w:unhideWhenUsed="0"/>
-    <w:lsdException w:name="heading 2" w:uiPriority="0" w:semiHidden="0" w:unhideWhenUsed="0" w:qFormat="1"/>
-    <w:lsdException w:name="Table Grid 8" w:uiPriority="0" w:semiHidden="0" w:unhideWhenUsed="0"/>
-    <w:lsdException w:name="Signature" w:uiPriority="0" w:semiHidden="0" w:unhideWhenUsed="0"/>
-    <w:lsdException w:name="Medium Grid 1 Accent 3" w:uiPriority="67" w:semiHidden="0" w:unhideWhenUsed="0"/>
-    <w:lsdException w:name="Table List 2" w:uiPriority="0" w:semiHidden="0" w:unhideWhenUsed="0"/>
-    <w:lsdException w:name="index heading" w:uiPriority="0" w:semiHidden="0" w:unhideWhenUsed="0"/>
-    <w:lsdException w:name="Medium List 1" w:uiPriority="65" w:semiHidden="0" w:unhideWhenUsed="0"/>
-    <w:lsdException w:name="List Number" w:uiPriority="0" w:semiHidden="0" w:unhideWhenUsed="0"/>
-    <w:lsdException w:name="Light Shading Accent 1" w:uiPriority="60" w:semiHidden="0" w:unhideWhenUsed="0"/>
-    <w:lsdException w:name="heading 6" w:uiPriority="0" w:semiHidden="0" w:unhideWhenUsed="0" w:qFormat="1"/>
-    <w:lsdException w:name="List Continue 5" w:uiPriority="0" w:semiHidden="0" w:unhideWhenUsed="0"/>
-    <w:lsdException w:name="Strong" w:uiPriority="0" w:semiHidden="0" w:unhideWhenUsed="0" w:qFormat="1"/>
-    <w:lsdException w:name="caption" w:uiPriority="0" w:qFormat="1"/>
-    <w:lsdException w:name="Table Simple 3" w:uiPriority="0" w:semiHidden="0" w:unhideWhenUsed="0"/>
-    <w:lsdException w:name="Date" w:uiPriority="0" w:semiHidden="0" w:unhideWhenUsed="0"/>
-    <w:lsdException w:name="Medium Grid 2 Accent 3" w:uiPriority="68" w:semiHidden="0" w:unhideWhenUsed="0"/>
-    <w:lsdException w:name="Body Text" w:uiPriority="0" w:semiHidden="0" w:unhideWhenUsed="0"/>
-    <w:lsdException w:name="Medium Shading 1 Accent 4" w:uiPriority="63" w:semiHidden="0" w:unhideWhenUsed="0"/>
-    <w:lsdException w:name="Table Elegant" w:uiPriority="0" w:semiHidden="0" w:unhideWhenUsed="0"/>
-    <w:lsdException w:name="HTML Typewriter" w:uiPriority="0" w:semiHidden="0" w:unhideWhenUsed="0"/>
-    <w:lsdException w:name="Note Heading" w:uiPriority="0" w:semiHidden="0" w:unhideWhenUsed="0"/>
-    <w:lsdException w:name="index 3" w:uiPriority="0" w:semiHidden="0" w:unhideWhenUsed="0"/>
-    <w:lsdException w:name="List Number 2" w:uiPriority="0" w:semiHidden="0" w:unhideWhenUsed="0"/>
   </w:latentStyles>
-  <w:style w:type="paragraph" w:styleId="000014">
-    <w:name w:val="List Paragraph"/>
+  <w:style w:type="paragraph" w:styleId="00000d">
+    <w:name w:val="heading 3"/>
+    <w:next w:val="000005"/>
     <w:uiPriority w:val="0"/>
     <w:qFormat w:val="1"/>
     <w:rPr>
       <w:rFonts w:ascii="Times New Roman" w:hAnsi="Times New Roman" w:eastAsia="思源黑体" w:cs="Times New Roman"/>
+      <w:color w:val="1F4D78"/>
+      <w:sz w:val="24"/>
+      <w:szCs w:val="24"/>
+    </w:rPr>
+  </w:style>
+  <w:style w:type="paragraph" w:styleId="000004">
+    <w:name w:val="heading 4"/>
+    <w:next w:val="000005"/>
+    <w:uiPriority w:val="0"/>
+    <w:qFormat w:val="1"/>
+    <w:rPr>
+      <w:rFonts w:ascii="Times New Roman" w:hAnsi="Times New Roman" w:eastAsia="思源黑体" w:cs="Times New Roman"/>
+      <w:i w:val="1"/>
+      <w:iCs w:val="1"/>
+      <w:color w:val="2E74B5"/>
       <w:sz w:val="21"/>
       <w:szCs w:val="21"/>
     </w:rPr>
   </w:style>
-  <w:style w:type="paragraph" w:styleId="00000a">
-    <w:name w:val="endnote text"/>
-    <w:link w:val="00000b"/>
+  <w:style w:type="paragraph" w:styleId="000009">
+    <w:name w:val="footnote text"/>
+    <w:link w:val="00000a"/>
     <w:uiPriority w:val="99"/>
     <w:semiHidden w:val="1"/>
     <w:unhideWhenUsed w:val="1"/>
@@ -3678,23 +3614,57 @@
       <w:szCs w:val="20"/>
     </w:rPr>
   </w:style>
-  <w:style w:type="paragraph" w:styleId="000005">
-    <w:name w:val="heading 4"/>
-    <w:next w:val="000001"/>
+  <w:style w:type="paragraph" w:styleId="000005" w:default="1">
+    <w:name w:val="Normal"/>
+    <w:uiPriority w:val="0"/>
+    <w:qFormat w:val="1"/>
+    <w:pPr>
+      <w:widowControl w:val="0"/>
+      <w:jc w:val="both"/>
+    </w:pPr>
+    <w:rPr>
+      <w:rFonts w:ascii="Times New Roman" w:hAnsi="Times New Roman" w:eastAsia="思源黑体" w:cs="Times New Roman"/>
+      <w:sz w:val="21"/>
+      <w:szCs w:val="21"/>
+    </w:rPr>
+  </w:style>
+  <w:style w:type="paragraph" w:styleId="000014">
+    <w:name w:val="heading 1"/>
+    <w:next w:val="000005"/>
+    <w:uiPriority w:val="0"/>
+    <w:qFormat w:val="1"/>
+    <w:pPr>
+      <w:spacing w:before="260" w:after="160"/>
+      <w:outlineLvl w:val="0"/>
+    </w:pPr>
+    <w:rPr>
+      <w:rFonts w:ascii="Times New Roman" w:hAnsi="Times New Roman" w:eastAsia="思源黑体" w:cs="Times New Roman"/>
+      <w:b w:val="1"/>
+      <w:bCs w:val="1"/>
+      <w:color w:val="8B0000"/>
+      <w:sz w:val="28"/>
+      <w:szCs w:val="28"/>
+    </w:rPr>
+  </w:style>
+  <w:style w:type="character" w:styleId="000010" w:default="1">
+    <w:name w:val="Default Paragraph Font"/>
+    <w:uiPriority w:val="0"/>
+    <w:semiHidden w:val="1"/>
+    <w:qFormat w:val="1"/>
+  </w:style>
+  <w:style w:type="paragraph" w:styleId="000001">
+    <w:name w:val="List Paragraph"/>
     <w:uiPriority w:val="0"/>
     <w:qFormat w:val="1"/>
     <w:rPr>
       <w:rFonts w:ascii="Times New Roman" w:hAnsi="Times New Roman" w:eastAsia="思源黑体" w:cs="Times New Roman"/>
-      <w:i w:val="1"/>
-      <w:iCs w:val="1"/>
-      <w:color w:val="2E74B5"/>
       <w:sz w:val="21"/>
       <w:szCs w:val="21"/>
     </w:rPr>
   </w:style>
-  <w:style w:type="paragraph" w:styleId="000003">
+  <w:style w:type="paragraph" w:styleId="000006">
     <w:name w:val="heading 2"/>
-    <w:next w:val="000001"/>
+    <w:next w:val="000005"/>
     <w:uiPriority w:val="0"/>
     <w:qFormat w:val="1"/>
     <w:pPr>
@@ -3710,9 +3680,9 @@
       <w:szCs w:val="23"/>
     </w:rPr>
   </w:style>
-  <w:style w:type="character" w:styleId="00000b" w:customStyle="1">
-    <w:name w:val="Endnote Text Char"/>
-    <w:link w:val="00000a"/>
+  <w:style w:type="character" w:styleId="00000a" w:customStyle="1">
+    <w:name w:val="Footnote Text Char"/>
+    <w:link w:val="000009"/>
     <w:uiPriority w:val="99"/>
     <w:semiHidden w:val="1"/>
     <w:unhideWhenUsed w:val="1"/>
@@ -3722,109 +3692,9 @@
       <w:szCs w:val="20"/>
     </w:rPr>
   </w:style>
-  <w:style w:type="paragraph" w:styleId="000006">
-    <w:name w:val="heading 5"/>
-    <w:next w:val="000001"/>
-    <w:uiPriority w:val="0"/>
-    <w:qFormat w:val="1"/>
-    <w:rPr>
-      <w:rFonts w:ascii="Times New Roman" w:hAnsi="Times New Roman" w:eastAsia="思源黑体" w:cs="Times New Roman"/>
-      <w:color w:val="2E74B5"/>
-      <w:sz w:val="21"/>
-      <w:szCs w:val="21"/>
-    </w:rPr>
-  </w:style>
-  <w:style w:type="character" w:styleId="000013">
-    <w:name w:val="footnote reference"/>
-    <w:uiPriority w:val="99"/>
-    <w:semiHidden w:val="1"/>
-    <w:unhideWhenUsed w:val="1"/>
-    <w:qFormat w:val="1"/>
-    <w:rPr>
-      <w:vertAlign w:val="superscript"/>
-    </w:rPr>
-  </w:style>
-  <w:style w:type="paragraph" w:styleId="00000e">
-    <w:name w:val="footnote text"/>
-    <w:link w:val="00000f"/>
-    <w:uiPriority w:val="99"/>
-    <w:semiHidden w:val="1"/>
-    <w:unhideWhenUsed w:val="1"/>
-    <w:qFormat w:val="1"/>
-    <w:pPr>
-      <w:spacing w:after="0" w:line="240" w:lineRule="auto"/>
-    </w:pPr>
-    <w:rPr>
-      <w:rFonts w:ascii="Times New Roman" w:hAnsi="Times New Roman" w:eastAsia="思源黑体" w:cs="Times New Roman"/>
-      <w:sz w:val="20"/>
-      <w:szCs w:val="20"/>
-    </w:rPr>
-  </w:style>
-  <w:style w:type="character" w:styleId="000012">
-    <w:name w:val="Hyperlink"/>
-    <w:uiPriority w:val="99"/>
-    <w:unhideWhenUsed w:val="1"/>
-    <w:qFormat w:val="1"/>
-    <w:rPr>
-      <w:color w:val="0563C1"/>
-      <w:u w:val="single"/>
-    </w:rPr>
-  </w:style>
-  <w:style w:type="paragraph" w:styleId="000007">
-    <w:name w:val="heading 6"/>
-    <w:next w:val="000001"/>
-    <w:uiPriority w:val="0"/>
-    <w:qFormat w:val="1"/>
-    <w:rPr>
-      <w:rFonts w:ascii="Times New Roman" w:hAnsi="Times New Roman" w:eastAsia="思源黑体" w:cs="Times New Roman"/>
-      <w:color w:val="1F4D78"/>
-      <w:sz w:val="21"/>
-      <w:szCs w:val="21"/>
-    </w:rPr>
-  </w:style>
-  <w:style w:type="character" w:styleId="00000f" w:customStyle="1">
-    <w:name w:val="Footnote Text Char"/>
-    <w:link w:val="00000e"/>
-    <w:uiPriority w:val="99"/>
-    <w:semiHidden w:val="1"/>
-    <w:unhideWhenUsed w:val="1"/>
-    <w:qFormat w:val="1"/>
-    <w:rPr>
-      <w:sz w:val="20"/>
-      <w:szCs w:val="20"/>
-    </w:rPr>
-  </w:style>
-  <w:style w:type="paragraph" w:styleId="000004">
-    <w:name w:val="heading 3"/>
-    <w:next w:val="000001"/>
-    <w:uiPriority w:val="0"/>
-    <w:qFormat w:val="1"/>
-    <w:rPr>
-      <w:rFonts w:ascii="Times New Roman" w:hAnsi="Times New Roman" w:eastAsia="思源黑体" w:cs="Times New Roman"/>
-      <w:color w:val="1F4D78"/>
-      <w:sz w:val="24"/>
-      <w:szCs w:val="24"/>
-    </w:rPr>
-  </w:style>
-  <w:style w:type="paragraph" w:styleId="00000c">
-    <w:name w:val="footer"/>
-    <w:basedOn w:val="000001"/>
-    <w:uiPriority w:val="0"/>
-    <w:pPr>
-      <w:tabs>
-        <w:tab w:val="center" w:pos="4153"/>
-        <w:tab w:val="right" w:pos="8306"/>
-      </w:tabs>
-      <w:snapToGrid w:val="0"/>
-      <w:jc w:val="left"/>
-    </w:pPr>
-    <w:rPr>
-      <w:sz w:val="18"/>
-    </w:rPr>
-  </w:style>
-  <w:style w:type="paragraph" w:styleId="00000d">
+  <w:style w:type="paragraph" w:styleId="00000f">
     <w:name w:val="header"/>
-    <w:basedOn w:val="000001"/>
+    <w:basedOn w:val="000005"/>
     <w:uiPriority w:val="0"/>
     <w:pPr>
       <w:pBdr>
@@ -3846,33 +3716,33 @@
       <w:sz w:val="18"/>
     </w:rPr>
   </w:style>
-  <w:style w:type="character" w:styleId="000008" w:default="1">
-    <w:name w:val="Default Paragraph Font"/>
-    <w:uiPriority w:val="0"/>
-    <w:semiHidden w:val="1"/>
-    <w:qFormat w:val="1"/>
-  </w:style>
-  <w:style w:type="character" w:styleId="000011">
-    <w:name w:val="endnote reference"/>
+  <w:style w:type="paragraph" w:styleId="000002">
+    <w:name w:val="endnote text"/>
+    <w:link w:val="000003"/>
     <w:uiPriority w:val="99"/>
     <w:semiHidden w:val="1"/>
     <w:unhideWhenUsed w:val="1"/>
     <w:qFormat w:val="1"/>
+    <w:pPr>
+      <w:spacing w:after="0" w:line="240" w:lineRule="auto"/>
+    </w:pPr>
     <w:rPr>
-      <w:vertAlign w:val="superscript"/>
+      <w:rFonts w:ascii="Times New Roman" w:hAnsi="Times New Roman" w:eastAsia="思源黑体" w:cs="Times New Roman"/>
+      <w:sz w:val="20"/>
+      <w:szCs w:val="20"/>
     </w:rPr>
   </w:style>
-  <w:style w:type="paragraph" w:styleId="000010">
-    <w:name w:val="Title"/>
-    <w:uiPriority w:val="0"/>
+  <w:style w:type="character" w:styleId="00000b">
+    <w:name w:val="Hyperlink"/>
+    <w:uiPriority w:val="99"/>
+    <w:unhideWhenUsed w:val="1"/>
     <w:qFormat w:val="1"/>
     <w:rPr>
-      <w:rFonts w:ascii="Times New Roman" w:hAnsi="Times New Roman" w:eastAsia="思源黑体" w:cs="Times New Roman"/>
-      <w:sz w:val="56"/>
-      <w:szCs w:val="56"/>
+      <w:color w:val="0563C1"/>
+      <w:u w:val="single"/>
     </w:rPr>
   </w:style>
-  <w:style w:type="table" w:styleId="000009" w:default="1">
+  <w:style w:type="table" w:styleId="000013" w:default="1">
     <w:name w:val="Normal Table"/>
     <w:uiPriority w:val="0"/>
     <w:semiHidden w:val="1"/>
@@ -3886,36 +3756,86 @@
       </w:tblCellMar>
     </w:tblPr>
   </w:style>
-  <w:style w:type="paragraph" w:styleId="000001" w:default="1">
-    <w:name w:val="Normal"/>
+  <w:style w:type="character" w:styleId="000011">
+    <w:name w:val="endnote reference"/>
+    <w:uiPriority w:val="99"/>
+    <w:semiHidden w:val="1"/>
+    <w:unhideWhenUsed w:val="1"/>
+    <w:qFormat w:val="1"/>
+    <w:rPr>
+      <w:vertAlign w:val="superscript"/>
+    </w:rPr>
+  </w:style>
+  <w:style w:type="paragraph" w:styleId="000012">
+    <w:name w:val="Title"/>
     <w:uiPriority w:val="0"/>
     <w:qFormat w:val="1"/>
-    <w:pPr>
-      <w:widowControl w:val="0"/>
-      <w:jc w:val="both"/>
-    </w:pPr>
     <w:rPr>
       <w:rFonts w:ascii="Times New Roman" w:hAnsi="Times New Roman" w:eastAsia="思源黑体" w:cs="Times New Roman"/>
+      <w:sz w:val="56"/>
+      <w:szCs w:val="56"/>
+    </w:rPr>
+  </w:style>
+  <w:style w:type="paragraph" w:styleId="00000c">
+    <w:name w:val="heading 6"/>
+    <w:next w:val="000005"/>
+    <w:uiPriority w:val="0"/>
+    <w:qFormat w:val="1"/>
+    <w:rPr>
+      <w:rFonts w:ascii="Times New Roman" w:hAnsi="Times New Roman" w:eastAsia="思源黑体" w:cs="Times New Roman"/>
+      <w:color w:val="1F4D78"/>
       <w:sz w:val="21"/>
       <w:szCs w:val="21"/>
     </w:rPr>
   </w:style>
-  <w:style w:type="paragraph" w:styleId="000002">
-    <w:name w:val="heading 1"/>
-    <w:next w:val="000001"/>
+  <w:style w:type="character" w:styleId="000008">
+    <w:name w:val="footnote reference"/>
+    <w:uiPriority w:val="99"/>
+    <w:semiHidden w:val="1"/>
+    <w:unhideWhenUsed w:val="1"/>
+    <w:qFormat w:val="1"/>
+    <w:rPr>
+      <w:vertAlign w:val="superscript"/>
+    </w:rPr>
+  </w:style>
+  <w:style w:type="paragraph" w:styleId="000007">
+    <w:name w:val="heading 5"/>
+    <w:next w:val="000005"/>
     <w:uiPriority w:val="0"/>
     <w:qFormat w:val="1"/>
+    <w:rPr>
+      <w:rFonts w:ascii="Times New Roman" w:hAnsi="Times New Roman" w:eastAsia="思源黑体" w:cs="Times New Roman"/>
+      <w:color w:val="2E74B5"/>
+      <w:sz w:val="21"/>
+      <w:szCs w:val="21"/>
+    </w:rPr>
+  </w:style>
+  <w:style w:type="paragraph" w:styleId="00000e">
+    <w:name w:val="footer"/>
+    <w:basedOn w:val="000005"/>
+    <w:uiPriority w:val="0"/>
     <w:pPr>
-      <w:spacing w:before="260" w:after="160"/>
-      <w:outlineLvl w:val="0"/>
+      <w:tabs>
+        <w:tab w:val="center" w:pos="4153"/>
+        <w:tab w:val="right" w:pos="8306"/>
+      </w:tabs>
+      <w:snapToGrid w:val="0"/>
+      <w:jc w:val="left"/>
     </w:pPr>
     <w:rPr>
-      <w:rFonts w:ascii="Times New Roman" w:hAnsi="Times New Roman" w:eastAsia="思源黑体" w:cs="Times New Roman"/>
-      <w:b w:val="1"/>
-      <w:bCs w:val="1"/>
-      <w:color w:val="8B0000"/>
-      <w:sz w:val="28"/>
-      <w:szCs w:val="28"/>
+      <w:sz w:val="18"/>
+    </w:rPr>
+  </w:style>
+  <w:style w:type="character" w:styleId="000003" w:customStyle="1">
+    <w:name w:val="Endnote Text Char"/>
+    <w:link w:val="000002"/>
+    <w:uiPriority w:val="99"/>
+    <w:semiHidden w:val="1"/>
+    <w:unhideWhenUsed w:val="1"/>
+    <w:qFormat w:val="1"/>
+    <w:rPr>
+      <w:sz w:val="20"/>
+      <w:szCs w:val="20"/>
     </w:rPr>
   </w:style>
 </w:styles>

</xml_diff>